<commit_message>
change in Assignment 29
</commit_message>
<xml_diff>
--- a/Assignment29/Assignment 29 _ Q&A chatbot Application (Ollama & Groq(used because openai is paid).docx
+++ b/Assignment29/Assignment 29 _ Q&A chatbot Application (Ollama & Groq(used because openai is paid).docx
@@ -86,9 +86,19 @@
             <w:u w:val="single"/>
             <w:rtl w:val="0"/>
           </w:rPr>
-          <w:t xml:space="preserve">https://www.linkedin.com/posts/ash-iiiiish_ai-llm-generativeai-ugcPost-7425203343666638848-OL5d</w:t>
+          <w:t xml:space="preserve">https://www.linkedin.com/posts/ash-iiiiish_ai-llm-generativeai-activity-7425519492761276416-nx2F</w:t>
         </w:r>
       </w:hyperlink>
+      <w:r>
+        <w:rPr>
+          <w:rtl w:val="0"/>
+        </w:rPr>
+      </w:r>
+    </w:p>
+    <w:p>
+      <w:pPr>
+        <w:rPr/>
+      </w:pPr>
       <w:r>
         <w:rPr>
           <w:rtl w:val="0"/>

</xml_diff>